<commit_message>
Add sensitivity and PK analysis updates
</commit_message>
<xml_diff>
--- a/02_Docs/Manuscript/S1.docx
+++ b/02_Docs/Manuscript/S1.docx
@@ -183,20 +183,64 @@
           <w:b/>
           <w:bCs/>
         </w:rPr>
-        <w:lastRenderedPageBreak/>
-        <w:t>S1.2. Fold-error comparison for monkey terminal clearance, AUC0-28d, and Cmax predicted using “a priori” PBPK and monkey-fitted top-down TMDD translation.</w:t>
+        <w:t xml:space="preserve">S1.2. Fold-error comparison for monkey </w:t>
       </w:r>
+      <w:del w:id="5" w:author="KM" w:date="2026-07-30T18:02:26Z">
+        <w:r>
+          <w:rPr>
+            <w:b/>
+            <w:bCs/>
+          </w:rPr>
+          <w:delText>terminal clearance</w:delText>
+        </w:r>
+      </w:del>
+      <w:ins w:id="6" w:author="KM" w:date="2026-07-30T18:02:26Z">
+        <w:r>
+          <w:rPr>
+            <w:b/>
+            <w:bCs/>
+          </w:rPr>
+          <w:t>clearance</w:t>
+        </w:r>
+      </w:ins>
       <w:r>
-        <w:t xml:space="preserve"> (A) Terminal clearance, representing nonlinear target-mediated elimination; (B) AUC0-28d and (C) Cmax, representing the predominantly linear elimination component. Fold error equals predicted divided by observed; bars extend from 1 on a base-2 logarithmic scale, and the shaded region and dashed lines indicate the 0.5- to 2-fold interval.</w:t>
+        <w:rPr>
+          <w:b/>
+          <w:bCs/>
+        </w:rPr>
+        <w:t>, AUC0-28d, and Cmax predicted using “a priori” PBPK and monkey-fitted top-down TMDD translation.</w:t>
+      </w:r>
+      <w:del w:id="1" w:author="KM" w:date="2026-07-30T18:02:26Z">
+        <w:r>
+          <w:delText xml:space="preserve"> (A) Terminal clearance, representing nonlinear target-mediated elimination; (B) AUC0-28d and (C) Cmax, representing the predominantly linear elimination component.</w:delText>
+        </w:r>
+      </w:del>
+      <w:ins w:id="2" w:author="KM" w:date="2026-07-30T18:02:26Z">
+        <w:r>
+          <w:t xml:space="preserve"> (A) Clearance, calculated as dose/AUCinf and representing total systemic clearance; (B) AUC0-28d; and (C) Cmax. At target-saturating doses, clearance is expected to be dominated by linear clearance.</w:t>
+        </w:r>
+      </w:ins>
+      <w:r>
+        <w:t xml:space="preserve"> Fold error equals predicted divided by observed; bars extend from 1 on a base-2 logarithmic scale, and the shaded region and dashed lines indicate the 0.5- to 2-fold interval.</w:t>
       </w:r>
     </w:p>
     <w:p>
-      <w:r>
-        <w:rPr>
-          <w:b/>
-        </w:rPr>
-        <w:t>(A) Monkey terminal clearance</w:t>
-      </w:r>
+      <w:del w:id="3" w:author="KM" w:date="2026-07-30T18:02:26Z">
+        <w:r>
+          <w:rPr>
+            <w:b/>
+          </w:rPr>
+          <w:delText>(A) Monkey terminal clearance</w:delText>
+        </w:r>
+      </w:del>
+      <w:ins w:id="4" w:author="KM" w:date="2026-07-30T18:02:26Z">
+        <w:r>
+          <w:rPr>
+            <w:b/>
+          </w:rPr>
+          <w:t>(A) Monkey clearance</w:t>
+        </w:r>
+      </w:ins>
     </w:p>
     <w:p>
       <w:pPr>
@@ -8873,7 +8917,11 @@
             </w:r>
             <w:proofErr w:type="spellEnd"/>
             <w:r>
-              <w:t xml:space="preserve"> (FcRn) in endosomal space</w:t>
+              <w:t xml:space="preserve"> (FcRn) in endosomal </w:t>
+            </w:r>
+            <w:r>
+              <w:lastRenderedPageBreak/>
+              <w:t>space</w:t>
             </w:r>
           </w:p>
         </w:tc>
@@ -8887,6 +8935,7 @@
               <w:jc w:val="right"/>
             </w:pPr>
             <w:r>
+              <w:lastRenderedPageBreak/>
               <w:t>1.05</w:t>
             </w:r>
           </w:p>
@@ -10003,6 +10052,7 @@
               <w:jc w:val="left"/>
             </w:pPr>
             <w:r>
+              <w:lastRenderedPageBreak/>
               <w:t>Golimumab</w:t>
             </w:r>
           </w:p>
@@ -10902,7 +10952,11 @@
               <w:jc w:val="left"/>
             </w:pPr>
             <w:r>
-              <w:t xml:space="preserve">Reference target concentration </w:t>
+              <w:t xml:space="preserve">Reference target </w:t>
+            </w:r>
+            <w:r>
+              <w:lastRenderedPageBreak/>
+              <w:t xml:space="preserve">concentration </w:t>
             </w:r>
           </w:p>
         </w:tc>
@@ -10916,6 +10970,7 @@
               <w:jc w:val="right"/>
             </w:pPr>
             <w:r>
+              <w:lastRenderedPageBreak/>
               <w:t>0.07138</w:t>
             </w:r>
           </w:p>
@@ -10946,7 +11001,11 @@
               <w:jc w:val="left"/>
             </w:pPr>
             <w:r>
-              <w:t>Model estimated by the authors of the source</w:t>
+              <w:t xml:space="preserve">Model estimated by the </w:t>
+            </w:r>
+            <w:r>
+              <w:lastRenderedPageBreak/>
+              <w:t>authors of the source</w:t>
             </w:r>
           </w:p>
         </w:tc>
@@ -10960,7 +11019,12 @@
               <w:jc w:val="center"/>
             </w:pPr>
             <w:r>
-              <w:t>A Priori and Top Down</w:t>
+              <w:lastRenderedPageBreak/>
+              <w:t xml:space="preserve">A Priori and </w:t>
+            </w:r>
+            <w:r>
+              <w:lastRenderedPageBreak/>
+              <w:t>Top Down</w:t>
             </w:r>
           </w:p>
         </w:tc>
@@ -10974,7 +11038,12 @@
               <w:jc w:val="left"/>
             </w:pPr>
             <w:r>
-              <w:t>Lindauer et al., 2017; https://doi.org/10.1002/psp4.12130</w:t>
+              <w:lastRenderedPageBreak/>
+              <w:t>Lindauer et al., 2017; https://doi.org/10.1002/psp4.</w:t>
+            </w:r>
+            <w:r>
+              <w:lastRenderedPageBreak/>
+              <w:t>12130</w:t>
             </w:r>
           </w:p>
         </w:tc>
@@ -10993,6 +11062,7 @@
               <w:jc w:val="left"/>
             </w:pPr>
             <w:r>
+              <w:lastRenderedPageBreak/>
               <w:t>Nivolumab</w:t>
             </w:r>
           </w:p>
@@ -12072,7 +12142,11 @@
               <w:jc w:val="center"/>
             </w:pPr>
             <w:r>
-              <w:t>A Priori and Top Down</w:t>
+              <w:t xml:space="preserve">A Priori and </w:t>
+            </w:r>
+            <w:r>
+              <w:lastRenderedPageBreak/>
+              <w:t>Top Down</w:t>
             </w:r>
           </w:p>
         </w:tc>
@@ -12086,7 +12160,12 @@
               <w:jc w:val="left"/>
             </w:pPr>
             <w:r>
-              <w:t>Xu et al., 2021 PMID: 33314148</w:t>
+              <w:lastRenderedPageBreak/>
+              <w:t xml:space="preserve">Xu et al., 2021 PMID: </w:t>
+            </w:r>
+            <w:r>
+              <w:lastRenderedPageBreak/>
+              <w:t>33314148</w:t>
             </w:r>
           </w:p>
         </w:tc>
@@ -12105,6 +12184,7 @@
               <w:jc w:val="left"/>
             </w:pPr>
             <w:r>
+              <w:lastRenderedPageBreak/>
               <w:t>Tocilizumab</w:t>
             </w:r>
           </w:p>
@@ -13409,6 +13489,7 @@
                 <w:sz w:val="24"/>
                 <w:szCs w:val="24"/>
               </w:rPr>
+              <w:lastRenderedPageBreak/>
               <w:t>Bevacizumab</w:t>
             </w:r>
           </w:p>

</xml_diff>